<commit_message>
Psicoanálisis: cuadro integrador de estructuras clínicas (2.º parcial)
Transversal_EstructurasClinicas_Guia (.md, .docx y diagrama):
- Cuadro 1: neurosis, perversión, psicosis y bordes en 13 ejes.
- Cuadro 2: histeria, obsesión y fobia en 9 ejes.
- Un desarrollo por eje, 15 pares "No confundir" entre clases y tres
  preguntas integradoras con esqueleto y respuesta modelo.

Se arma solo con las 8 guías del parcial. Cada celda lleva su cita APA y
la sección de la guía donde se desarrolla.

Se regeneran los Word de las 8 guías con el exportador corregido.

Co-Authored-By: Claude Opus 5.5 <noreply@anthropic.com>
</commit_message>
<xml_diff>
--- a/2do Año/Psicoanálisis/3_Guias_de_Estudio/C14_SintomaFantasmaYAngustia_Guia.docx
+++ b/2do Año/Psicoanálisis/3_Guias_de_Estudio/C14_SintomaFantasmaYAngustia_Guia.docx
@@ -5231,324 +5231,23 @@
         <w:t xml:space="preserve"> </w:t>
       </w:r>
       <w:r>
-        <w:t xml:space="preserve">en la neurosis,</w:t>
-      </w:r>
-      <w:r>
-        <w:t xml:space="preserve"> </w:t>
-      </w:r>
-      <m:oMath>
-        <m:r>
-          <m:rPr>
-            <m:sty m:val="p"/>
-          </m:rPr>
-          <m:t>◊</m:t>
-        </m:r>
-        <m:r>
-          <m:t>a</m:t>
-        </m:r>
-        <m:r>
-          <m:rPr>
-            <m:sty m:val="p"/>
-          </m:rPr>
-          <m:t>:</m:t>
-        </m:r>
-        <m:r>
-          <m:t>e</m:t>
-        </m:r>
-        <m:r>
-          <m:t>l</m:t>
-        </m:r>
-        <m:r>
-          <m:t>s</m:t>
-        </m:r>
-        <m:r>
-          <m:t>u</m:t>
-        </m:r>
-        <m:r>
-          <m:t>j</m:t>
-        </m:r>
-        <m:r>
-          <m:t>e</m:t>
-        </m:r>
-        <m:r>
-          <m:t>t</m:t>
-        </m:r>
-        <m:r>
-          <m:t>o</m:t>
-        </m:r>
-        <m:r>
-          <m:t>r</m:t>
-        </m:r>
-        <m:r>
-          <m:t>e</m:t>
-        </m:r>
-        <m:r>
-          <m:t>s</m:t>
-        </m:r>
-        <m:r>
-          <m:t>u</m:t>
-        </m:r>
-        <m:r>
-          <m:t>e</m:t>
-        </m:r>
-        <m:r>
-          <m:t>l</m:t>
-        </m:r>
-        <m:r>
-          <m:t>v</m:t>
-        </m:r>
-        <m:r>
-          <m:t>e</m:t>
-        </m:r>
-        <m:r>
-          <m:t>s</m:t>
-        </m:r>
-        <m:r>
-          <m:t>u</m:t>
-        </m:r>
-        <m:r>
-          <m:t>d</m:t>
-        </m:r>
-        <m:r>
-          <m:t>i</m:t>
-        </m:r>
-        <m:r>
-          <m:t>v</m:t>
-        </m:r>
-        <m:r>
-          <m:t>i</m:t>
-        </m:r>
-        <m:r>
-          <m:t>s</m:t>
-        </m:r>
-        <m:r>
-          <m:t>i</m:t>
-        </m:r>
-        <m:r>
-          <m:t>ó</m:t>
-        </m:r>
-        <m:r>
-          <m:t>n</m:t>
-        </m:r>
-        <m:r>
-          <m:t>c</m:t>
-        </m:r>
-        <m:r>
-          <m:t>o</m:t>
-        </m:r>
-        <m:r>
-          <m:t>n</m:t>
-        </m:r>
-        <m:r>
-          <m:t>j</m:t>
-        </m:r>
-        <m:r>
-          <m:t>u</m:t>
-        </m:r>
-        <m:r>
-          <m:t>g</m:t>
-        </m:r>
-        <m:r>
-          <m:t>á</m:t>
-        </m:r>
-        <m:r>
-          <m:t>n</m:t>
-        </m:r>
-        <m:r>
-          <m:t>d</m:t>
-        </m:r>
-        <m:r>
-          <m:t>o</m:t>
-        </m:r>
-        <m:r>
-          <m:t>s</m:t>
-        </m:r>
-        <m:r>
-          <m:t>e</m:t>
-        </m:r>
-        <m:r>
-          <m:t>c</m:t>
-        </m:r>
-        <m:r>
-          <m:t>o</m:t>
-        </m:r>
-        <m:r>
-          <m:t>n</m:t>
-        </m:r>
-        <m:r>
-          <m:t>u</m:t>
-        </m:r>
-        <m:r>
-          <m:t>n</m:t>
-        </m:r>
-        <m:r>
-          <m:t>o</m:t>
-        </m:r>
-        <m:r>
-          <m:t>b</m:t>
-        </m:r>
-        <m:r>
-          <m:t>j</m:t>
-        </m:r>
-        <m:r>
-          <m:t>e</m:t>
-        </m:r>
-        <m:r>
-          <m:t>t</m:t>
-        </m:r>
-        <m:r>
-          <m:t>o</m:t>
-        </m:r>
-        <m:r>
-          <m:rPr>
-            <m:sty m:val="p"/>
-          </m:rPr>
-          <m:t>;</m:t>
-        </m:r>
-        <m:r>
-          <m:t>e</m:t>
-        </m:r>
-        <m:r>
-          <m:t>n</m:t>
-        </m:r>
-        <m:r>
-          <m:t>l</m:t>
-        </m:r>
-        <m:r>
-          <m:t>a</m:t>
-        </m:r>
-        <m:r>
-          <m:t>p</m:t>
-        </m:r>
-        <m:r>
-          <m:t>e</m:t>
-        </m:r>
-        <m:r>
-          <m:t>r</m:t>
-        </m:r>
-        <m:r>
-          <m:t>v</m:t>
-        </m:r>
-        <m:r>
-          <m:t>e</m:t>
-        </m:r>
-        <m:r>
-          <m:t>r</m:t>
-        </m:r>
-        <m:r>
-          <m:t>s</m:t>
-        </m:r>
-        <m:r>
-          <m:t>i</m:t>
-        </m:r>
-        <m:r>
-          <m:t>ó</m:t>
-        </m:r>
-        <m:r>
-          <m:t>n</m:t>
-        </m:r>
-        <m:r>
-          <m:rPr>
-            <m:sty m:val="p"/>
-          </m:rPr>
-          <m:t>*</m:t>
-        </m:r>
-        <m:r>
-          <m:rPr>
-            <m:sty m:val="p"/>
-          </m:rPr>
-          <m:t>*</m:t>
-        </m:r>
-        <m:r>
-          <m:t>e</m:t>
-        </m:r>
-        <m:r>
-          <m:t>l</m:t>
-        </m:r>
-        <m:r>
-          <m:t>o</m:t>
-        </m:r>
-        <m:r>
-          <m:t>r</m:t>
-        </m:r>
-        <m:r>
-          <m:t>d</m:t>
-        </m:r>
-        <m:r>
-          <m:t>e</m:t>
-        </m:r>
-        <m:r>
-          <m:t>n</m:t>
-        </m:r>
-        <m:r>
-          <m:t>e</m:t>
-        </m:r>
-        <m:r>
-          <m:t>s</m:t>
-        </m:r>
-        <m:r>
-          <m:t>t</m:t>
-        </m:r>
-        <m:r>
-          <m:t>á</m:t>
-        </m:r>
-        <m:r>
-          <m:t>i</m:t>
-        </m:r>
-        <m:r>
-          <m:t>n</m:t>
-        </m:r>
-        <m:r>
-          <m:t>v</m:t>
-        </m:r>
-        <m:r>
-          <m:t>e</m:t>
-        </m:r>
-        <m:r>
-          <m:t>r</m:t>
-        </m:r>
-        <m:r>
-          <m:t>t</m:t>
-        </m:r>
-        <m:r>
-          <m:t>i</m:t>
-        </m:r>
-        <m:r>
-          <m:t>d</m:t>
-        </m:r>
-        <m:r>
-          <m:t>o</m:t>
-        </m:r>
-        <m:r>
-          <m:rPr>
-            <m:sty m:val="p"/>
-          </m:rPr>
-          <m:t>*</m:t>
-        </m:r>
-        <m:r>
-          <m:rPr>
-            <m:sty m:val="p"/>
-          </m:rPr>
-          <m:t>*</m:t>
-        </m:r>
-        <m:r>
-          <m:rPr>
-            <m:sty m:val="p"/>
-          </m:rPr>
-          <m:t>(</m:t>
-        </m:r>
-        <m:r>
-          <m:t>a</m:t>
-        </m:r>
-        <m:r>
-          <m:rPr>
-            <m:sty m:val="p"/>
-          </m:rPr>
-          <m:t>◊</m:t>
-        </m:r>
-      </m:oMath>
-      <w:r>
-        <w:t xml:space="preserve">): el perverso se ubica en el lugar del objeto y desde ahí promueve la</w:t>
+        <w:t xml:space="preserve">en la neurosis, $◊a: el sujeto resuelve su división conjugándose con un objeto; en la perversión</w:t>
+      </w:r>
+      <w:r>
+        <w:t xml:space="preserve"> </w:t>
+      </w:r>
+      <w:r>
+        <w:rPr>
+          <w:b/>
+          <w:bCs/>
+        </w:rPr>
+        <w:t xml:space="preserve">el orden está invertido</w:t>
+      </w:r>
+      <w:r>
+        <w:t xml:space="preserve"> </w:t>
+      </w:r>
+      <w:r>
+        <w:t xml:space="preserve">(a◊$): el perverso se ubica en el lugar del objeto y desde ahí promueve la</w:t>
       </w:r>
       <w:r>
         <w:t xml:space="preserve"> </w:t>

</xml_diff>